<commit_message>
Drop the correspondence and funding line from the title block
The masthead now runs title, authors, affiliations, straight into the
executive summary. The funding ask is still stated where it belongs — in
the team-and-budget section and Table I's caption — rather than announced
under the byline.

Removed from content.py and from both renderers, so the .docx and the
preview stay in step. Rebuild is clean: 69/69 validator checks, 5 pages.

Co-Authored-By: Claude Opus 5 <noreply@anthropic.com>
Claude-Session: https://claude.ai/code/session_017i6UX6Xstg3wsHBwZ6JkU2
</commit_message>
<xml_diff>
--- a/docs/proposal/Horizon-RIC_AI-RAN_Call-for-Innovation_Proposal.docx
+++ b/docs/proposal/Horizon-RIC_AI-RAN_Call-for-Innovation_Proposal.docx
@@ -36,20 +36,6 @@
           <w:sz w:val="19"/>
         </w:rPr>
         <w:t>¹PreceptualAI, Singapore · ²Nanyang Technological University, Singapore</w:t>
-      </w:r>
-    </w:p>
-    <w:p>
-      <w:pPr>
-        <w:pStyle w:val="IEEEAuthors"/>
-        <w:spacing w:after="20"/>
-      </w:pPr>
-      <w:r>
-        <w:rPr>
-          <w:rFonts w:ascii="Times New Roman" w:hAnsi="Times New Roman"/>
-          <w:i w:val="0"/>
-          <w:sz w:val="17"/>
-        </w:rPr>
-        <w:t>Correspondence: Daniel Foo — danielfoojunwei@gmail.com  ·  Funding requested: US$150,000 over 12 months</w:t>
       </w:r>
     </w:p>
     <w:p>

</xml_diff>